<commit_message>
aggr-apps forms for industry are updated and not shipbourn product form is added
</commit_message>
<xml_diff>
--- a/backend/templates/docx/810_1_2_p.docx
+++ b/backend/templates/docx/810_1_2_p.docx
@@ -123,6 +123,7 @@
           </w:tcPr>
           <w:p>
             <w:pPr>
+              <w:jc w:val="center"/>
               <w:rPr>
                 <w:rFonts w:ascii="Times New Roman" w:hAnsi="Times New Roman" w:cs="Times New Roman"/>
                 <w:b/>
@@ -182,6 +183,7 @@
           </w:tcPr>
           <w:p>
             <w:pPr>
+              <w:jc w:val="center"/>
               <w:rPr>
                 <w:rFonts w:ascii="Times New Roman" w:hAnsi="Times New Roman" w:cs="Times New Roman"/>
                 <w:sz w:val="18"/>
@@ -385,6 +387,7 @@
           </w:tcPr>
           <w:p>
             <w:pPr>
+              <w:jc w:val="center"/>
               <w:rPr>
                 <w:rFonts w:ascii="Times New Roman" w:hAnsi="Times New Roman" w:cs="Times New Roman"/>
                 <w:sz w:val="18"/>
@@ -536,7 +539,6 @@
                 <w:rFonts w:ascii="Times New Roman" w:hAnsi="Times New Roman" w:cs="Times New Roman"/>
                 <w:sz w:val="18"/>
                 <w:szCs w:val="18"/>
-                <w:lang w:val="en-US"/>
               </w:rPr>
             </w:pPr>
             <w:proofErr w:type="gramStart"/>
@@ -648,7 +650,6 @@
                 <w:rFonts w:ascii="Times New Roman" w:hAnsi="Times New Roman" w:cs="Times New Roman"/>
                 <w:sz w:val="18"/>
                 <w:szCs w:val="18"/>
-                <w:lang w:val="en-US"/>
               </w:rPr>
             </w:pPr>
             <w:proofErr w:type="gramStart"/>
@@ -918,7 +919,23 @@
                 <w:sz w:val="18"/>
                 <w:szCs w:val="18"/>
               </w:rPr>
-              <w:t xml:space="preserve"> Регистр) выполнить:</w:t>
+              <w:t xml:space="preserve"> Регистр) выполнить</w:t>
+            </w:r>
+            <w:r>
+              <w:rPr>
+                <w:rFonts w:ascii="Times New Roman" w:hAnsi="Times New Roman" w:cs="Times New Roman"/>
+                <w:sz w:val="18"/>
+                <w:szCs w:val="18"/>
+              </w:rPr>
+              <w:t xml:space="preserve"> (далее – оказать услуги)</w:t>
+            </w:r>
+            <w:r>
+              <w:rPr>
+                <w:rFonts w:ascii="Times New Roman" w:hAnsi="Times New Roman" w:cs="Times New Roman"/>
+                <w:sz w:val="18"/>
+                <w:szCs w:val="18"/>
+              </w:rPr>
+              <w:t>:</w:t>
             </w:r>
           </w:p>
         </w:tc>
@@ -1837,6 +1854,7 @@
                     <w:jc w:val="both"/>
                     <w:rPr>
                       <w:rFonts w:ascii="Times New Roman" w:hAnsi="Times New Roman" w:cs="Times New Roman"/>
+                      <w:spacing w:val="-2"/>
                       <w:sz w:val="18"/>
                       <w:szCs w:val="18"/>
                     </w:rPr>
@@ -1844,6 +1862,7 @@
                   <w:r>
                     <w:rPr>
                       <w:rFonts w:ascii="Times New Roman" w:hAnsi="Times New Roman" w:cs="Times New Roman"/>
+                      <w:spacing w:val="-2"/>
                       <w:sz w:val="18"/>
                       <w:szCs w:val="18"/>
                     </w:rPr>
@@ -1852,6 +1871,7 @@
                   <w:r>
                     <w:rPr>
                       <w:rFonts w:ascii="Times New Roman" w:hAnsi="Times New Roman" w:cs="Times New Roman"/>
+                      <w:spacing w:val="-2"/>
                       <w:sz w:val="18"/>
                       <w:szCs w:val="18"/>
                       <w:vertAlign w:val="superscript"/>
@@ -1861,6 +1881,7 @@
                   <w:r>
                     <w:rPr>
                       <w:rFonts w:ascii="Times New Roman" w:hAnsi="Times New Roman" w:cs="Times New Roman"/>
+                      <w:spacing w:val="-2"/>
                       <w:sz w:val="18"/>
                       <w:szCs w:val="18"/>
                     </w:rPr>
@@ -1869,6 +1890,70 @@
                   <w:r>
                     <w:rPr>
                       <w:rFonts w:ascii="Times New Roman" w:hAnsi="Times New Roman" w:cs="Times New Roman"/>
+                      <w:spacing w:val="-2"/>
+                      <w:sz w:val="18"/>
+                      <w:szCs w:val="18"/>
+                    </w:rPr>
+                    <w:t>/</w:t>
+                  </w:r>
+                  <w:r>
+                    <w:rPr>
+                      <w:rFonts w:ascii="Times New Roman" w:hAnsi="Times New Roman" w:cs="Times New Roman"/>
+                      <w:spacing w:val="-2"/>
+                      <w:sz w:val="18"/>
+                      <w:szCs w:val="18"/>
+                    </w:rPr>
+                    <w:t>плавучих</w:t>
+                  </w:r>
+                  <w:r>
+                    <w:rPr>
+                      <w:rFonts w:ascii="Times New Roman" w:hAnsi="Times New Roman" w:cs="Times New Roman"/>
+                      <w:spacing w:val="-2"/>
+                      <w:sz w:val="18"/>
+                      <w:szCs w:val="18"/>
+                    </w:rPr>
+                    <w:t xml:space="preserve"> </w:t>
+                  </w:r>
+                  <w:r>
+                    <w:rPr>
+                      <w:rFonts w:ascii="Times New Roman" w:hAnsi="Times New Roman" w:cs="Times New Roman"/>
+                      <w:spacing w:val="-2"/>
+                      <w:sz w:val="18"/>
+                      <w:szCs w:val="18"/>
+                    </w:rPr>
+                    <w:t>объектах</w:t>
+                  </w:r>
+                  <w:r>
+                    <w:rPr>
+                      <w:rFonts w:ascii="Times New Roman" w:hAnsi="Times New Roman" w:cs="Times New Roman"/>
+                      <w:spacing w:val="-2"/>
+                      <w:sz w:val="18"/>
+                      <w:szCs w:val="18"/>
+                    </w:rPr>
+                    <w:t xml:space="preserve"> </w:t>
+                  </w:r>
+                  <w:r>
+                    <w:rPr>
+                      <w:rStyle w:val="af"/>
+                      <w:spacing w:val="-2"/>
+                      <w:sz w:val="14"/>
+                      <w:szCs w:val="14"/>
+                    </w:rPr>
+                    <w:t>2</w:t>
+                  </w:r>
+                  <w:r>
+                    <w:rPr>
+                      <w:rFonts w:ascii="Times New Roman" w:hAnsi="Times New Roman" w:cs="Times New Roman"/>
+                      <w:spacing w:val="-2"/>
+                      <w:sz w:val="18"/>
+                      <w:szCs w:val="18"/>
+                    </w:rPr>
+                    <w:t xml:space="preserve"> </w:t>
+                  </w:r>
+                  <w:r>
+                    <w:rPr>
+                      <w:rFonts w:ascii="Times New Roman" w:hAnsi="Times New Roman" w:cs="Times New Roman"/>
+                      <w:spacing w:val="-2"/>
                       <w:sz w:val="18"/>
                       <w:szCs w:val="18"/>
                       <w:vertAlign w:val="superscript"/>
@@ -2027,6 +2112,7 @@
               </w:tc>
             </w:tr>
             <w:tr>
+              <w:bookmarkStart w:id="0" w:name="_Hlk225763939" w:displacedByCustomXml="next"/>
               <w:sdt>
                 <w:sdtPr>
                   <w:rPr>
@@ -2143,7 +2229,402 @@
                       <w:sz w:val="18"/>
                       <w:szCs w:val="18"/>
                     </w:rPr>
-                    <w:t>Подтверждение соответствия Техническому регламенту о безопасности объектов морского транспорта, утвержденному Постановлением Правительства РФ от 12.08.2010 № 620 (Код ОКП)</w:t>
+                    <w:t>Оценк</w:t>
+                  </w:r>
+                  <w:r>
+                    <w:rPr>
+                      <w:rFonts w:ascii="Times New Roman" w:hAnsi="Times New Roman" w:cs="Times New Roman"/>
+                      <w:sz w:val="18"/>
+                      <w:szCs w:val="18"/>
+                    </w:rPr>
+                    <w:t>у</w:t>
+                  </w:r>
+                  <w:r>
+                    <w:rPr>
+                      <w:rFonts w:ascii="Times New Roman" w:hAnsi="Times New Roman" w:cs="Times New Roman"/>
+                      <w:sz w:val="18"/>
+                      <w:szCs w:val="18"/>
+                    </w:rPr>
+                    <w:t xml:space="preserve"> соответствия</w:t>
+                  </w:r>
+                  <w:r>
+                    <w:rPr>
+                      <w:rFonts w:ascii="Times New Roman" w:hAnsi="Times New Roman" w:cs="Times New Roman"/>
+                      <w:sz w:val="18"/>
+                      <w:szCs w:val="18"/>
+                    </w:rPr>
+                    <w:t xml:space="preserve"> Техническому регламенту о безопасности объектов морского транспорта, утвержденному </w:t>
+                  </w:r>
+                  <w:r>
+                    <w:rPr>
+                      <w:rFonts w:ascii="Times New Roman" w:hAnsi="Times New Roman" w:cs="Times New Roman"/>
+                      <w:sz w:val="18"/>
+                      <w:szCs w:val="18"/>
+                    </w:rPr>
+                    <w:t>п</w:t>
+                  </w:r>
+                  <w:r>
+                    <w:rPr>
+                      <w:rFonts w:ascii="Times New Roman" w:hAnsi="Times New Roman" w:cs="Times New Roman"/>
+                      <w:sz w:val="18"/>
+                      <w:szCs w:val="18"/>
+                    </w:rPr>
+                    <w:t>остановлением Правительства Р</w:t>
+                  </w:r>
+                  <w:r>
+                    <w:rPr>
+                      <w:rFonts w:ascii="Times New Roman" w:hAnsi="Times New Roman" w:cs="Times New Roman"/>
+                      <w:sz w:val="18"/>
+                      <w:szCs w:val="18"/>
+                    </w:rPr>
+                    <w:t xml:space="preserve">оссийской </w:t>
+                  </w:r>
+                  <w:r>
+                    <w:rPr>
+                      <w:rFonts w:ascii="Times New Roman" w:hAnsi="Times New Roman" w:cs="Times New Roman"/>
+                      <w:sz w:val="18"/>
+                      <w:szCs w:val="18"/>
+                    </w:rPr>
+                    <w:t>Ф</w:t>
+                  </w:r>
+                  <w:r>
+                    <w:rPr>
+                      <w:rFonts w:ascii="Times New Roman" w:hAnsi="Times New Roman" w:cs="Times New Roman"/>
+                      <w:sz w:val="18"/>
+                      <w:szCs w:val="18"/>
+                    </w:rPr>
+                    <w:t>едерации</w:t>
+                  </w:r>
+                  <w:r>
+                    <w:rPr>
+                      <w:rFonts w:ascii="Times New Roman" w:hAnsi="Times New Roman" w:cs="Times New Roman"/>
+                      <w:sz w:val="18"/>
+                      <w:szCs w:val="18"/>
+                    </w:rPr>
+                    <w:t xml:space="preserve"> от </w:t>
+                  </w:r>
+                  <w:r>
+                    <w:rPr>
+                      <w:rFonts w:ascii="Times New Roman" w:hAnsi="Times New Roman" w:cs="Times New Roman"/>
+                      <w:sz w:val="18"/>
+                      <w:szCs w:val="18"/>
+                    </w:rPr>
+                    <w:t>29</w:t>
+                  </w:r>
+                  <w:r>
+                    <w:rPr>
+                      <w:rFonts w:ascii="Times New Roman" w:hAnsi="Times New Roman" w:cs="Times New Roman"/>
+                      <w:sz w:val="18"/>
+                      <w:szCs w:val="18"/>
+                    </w:rPr>
+                    <w:t>.08.20</w:t>
+                  </w:r>
+                  <w:r>
+                    <w:rPr>
+                      <w:rFonts w:ascii="Times New Roman" w:hAnsi="Times New Roman" w:cs="Times New Roman"/>
+                      <w:sz w:val="18"/>
+                      <w:szCs w:val="18"/>
+                    </w:rPr>
+                    <w:t>25</w:t>
+                  </w:r>
+                  <w:r>
+                    <w:rPr>
+                      <w:rFonts w:ascii="Times New Roman" w:hAnsi="Times New Roman" w:cs="Times New Roman"/>
+                      <w:sz w:val="18"/>
+                      <w:szCs w:val="18"/>
+                    </w:rPr>
+                    <w:t xml:space="preserve"> №</w:t>
+                  </w:r>
+                  <w:r>
+                    <w:rPr>
+                      <w:rFonts w:ascii="Times New Roman" w:hAnsi="Times New Roman" w:cs="Times New Roman"/>
+                      <w:sz w:val="18"/>
+                      <w:szCs w:val="18"/>
+                    </w:rPr>
+                    <w:t xml:space="preserve"> 1307</w:t>
+                  </w:r>
+                  <w:r>
+                    <w:rPr>
+                      <w:rFonts w:ascii="Times New Roman" w:hAnsi="Times New Roman" w:cs="Times New Roman"/>
+                      <w:sz w:val="18"/>
+                      <w:szCs w:val="18"/>
+                    </w:rPr>
+                    <w:t xml:space="preserve"> </w:t>
+                  </w:r>
+                </w:p>
+              </w:tc>
+            </w:tr>
+            <w:tr>
+              <w:bookmarkEnd w:id="0" w:displacedByCustomXml="next"/>
+              <w:sdt>
+                <w:sdtPr>
+                  <w:rPr>
+                    <w:rFonts w:ascii="Times New Roman" w:hAnsi="Times New Roman" w:cs="Times New Roman"/>
+                    <w:sz w:val="18"/>
+                    <w:szCs w:val="18"/>
+                    <w:lang w:val="en-GB"/>
+                  </w:rPr>
+                  <w:id w:val="-885784352"/>
+                  <w14:checkbox>
+                    <w14:checked w14:val="0"/>
+                    <w14:checkedState w14:val="2612" w14:font="Yu Gothic UI"/>
+                    <w14:uncheckedState w14:val="2610" w14:font="Yu Gothic UI"/>
+                  </w14:checkbox>
+                </w:sdtPr>
+                <w:sdtContent>
+                  <w:tc>
+                    <w:tcPr>
+                      <w:tcW w:w="180" w:type="pct"/>
+                      <w:tcBorders>
+                        <w:top w:val="single" w:sz="8" w:space="0" w:color="808080" w:themeColor="background1" w:themeShade="80"/>
+                        <w:left w:val="single" w:sz="12" w:space="0" w:color="808080" w:themeColor="background1" w:themeShade="80"/>
+                        <w:bottom w:val="single" w:sz="8" w:space="0" w:color="808080" w:themeColor="background1" w:themeShade="80"/>
+                      </w:tcBorders>
+                      <w:vAlign w:val="center"/>
+                    </w:tcPr>
+                    <w:p>
+                      <w:pPr>
+                        <w:framePr w:hSpace="180" w:wrap="around" w:vAnchor="page" w:hAnchor="margin" w:y="1111"/>
+                        <w:ind w:right="-108"/>
+                        <w:rPr>
+                          <w:rFonts w:ascii="Times New Roman" w:hAnsi="Times New Roman" w:cs="Times New Roman"/>
+                          <w:sz w:val="18"/>
+                          <w:szCs w:val="18"/>
+                          <w:lang w:val="en-GB"/>
+                        </w:rPr>
+                      </w:pPr>
+                      <w:r>
+                        <w:rPr>
+                          <w:rFonts w:ascii="MS Mincho" w:eastAsia="MS Mincho" w:hAnsi="MS Mincho" w:cs="Times New Roman" w:hint="eastAsia"/>
+                          <w:sz w:val="18"/>
+                          <w:szCs w:val="18"/>
+                          <w:lang w:val="en-GB"/>
+                        </w:rPr>
+                        <w:t>☐</w:t>
+                      </w:r>
+                    </w:p>
+                  </w:tc>
+                </w:sdtContent>
+              </w:sdt>
+              <w:tc>
+                <w:tcPr>
+                  <w:tcW w:w="114" w:type="pct"/>
+                  <w:tcBorders>
+                    <w:top w:val="single" w:sz="8" w:space="0" w:color="808080" w:themeColor="background1" w:themeShade="80"/>
+                    <w:bottom w:val="single" w:sz="8" w:space="0" w:color="808080" w:themeColor="background1" w:themeShade="80"/>
+                  </w:tcBorders>
+                  <w:vAlign w:val="center"/>
+                </w:tcPr>
+                <w:p>
+                  <w:pPr>
+                    <w:framePr w:hSpace="180" w:wrap="around" w:vAnchor="page" w:hAnchor="margin" w:y="1111"/>
+                    <w:ind w:left="-113"/>
+                    <w:rPr>
+                      <w:rFonts w:ascii="Times New Roman" w:hAnsi="Times New Roman" w:cs="Times New Roman"/>
+                      <w:sz w:val="18"/>
+                      <w:szCs w:val="18"/>
+                      <w:vertAlign w:val="superscript"/>
+                    </w:rPr>
+                  </w:pPr>
+                  <w:r>
+                    <w:rPr>
+                      <w:rFonts w:ascii="Times New Roman" w:hAnsi="Times New Roman" w:cs="Times New Roman"/>
+                      <w:sz w:val="18"/>
+                      <w:szCs w:val="18"/>
+                      <w:vertAlign w:val="superscript"/>
+                    </w:rPr>
+                    <w:t>1</w:t>
+                  </w:r>
+                  <w:r>
+                    <w:rPr>
+                      <w:rFonts w:ascii="Times New Roman" w:hAnsi="Times New Roman" w:cs="Times New Roman"/>
+                      <w:sz w:val="18"/>
+                      <w:szCs w:val="18"/>
+                      <w:vertAlign w:val="superscript"/>
+                    </w:rPr>
+                    <w:t>1</w:t>
+                  </w:r>
+                </w:p>
+              </w:tc>
+              <w:tc>
+                <w:tcPr>
+                  <w:tcW w:w="4706" w:type="pct"/>
+                  <w:gridSpan w:val="3"/>
+                  <w:tcBorders>
+                    <w:top w:val="single" w:sz="8" w:space="0" w:color="808080" w:themeColor="background1" w:themeShade="80"/>
+                    <w:bottom w:val="single" w:sz="8" w:space="0" w:color="808080" w:themeColor="background1" w:themeShade="80"/>
+                    <w:right w:val="single" w:sz="12" w:space="0" w:color="808080" w:themeColor="background1" w:themeShade="80"/>
+                  </w:tcBorders>
+                </w:tcPr>
+                <w:p>
+                  <w:pPr>
+                    <w:framePr w:hSpace="180" w:wrap="around" w:vAnchor="page" w:hAnchor="margin" w:y="1111"/>
+                    <w:jc w:val="both"/>
+                    <w:rPr>
+                      <w:rFonts w:ascii="Times New Roman" w:hAnsi="Times New Roman" w:cs="Times New Roman"/>
+                      <w:sz w:val="18"/>
+                      <w:szCs w:val="18"/>
+                    </w:rPr>
+                  </w:pPr>
+                  <w:r>
+                    <w:rPr>
+                      <w:rFonts w:ascii="Times New Roman" w:hAnsi="Times New Roman" w:cs="Times New Roman"/>
+                      <w:sz w:val="18"/>
+                      <w:szCs w:val="18"/>
+                    </w:rPr>
+                    <w:t>Оценк</w:t>
+                  </w:r>
+                  <w:r>
+                    <w:rPr>
+                      <w:rFonts w:ascii="Times New Roman" w:hAnsi="Times New Roman" w:cs="Times New Roman"/>
+                      <w:sz w:val="18"/>
+                      <w:szCs w:val="18"/>
+                    </w:rPr>
+                    <w:t>у</w:t>
+                  </w:r>
+                  <w:r>
+                    <w:rPr>
+                      <w:rFonts w:ascii="Times New Roman" w:hAnsi="Times New Roman" w:cs="Times New Roman"/>
+                      <w:sz w:val="18"/>
+                      <w:szCs w:val="18"/>
+                    </w:rPr>
+                    <w:t xml:space="preserve"> соответствия</w:t>
+                  </w:r>
+                  <w:r>
+                    <w:rPr>
+                      <w:rFonts w:ascii="Times New Roman" w:hAnsi="Times New Roman" w:cs="Times New Roman"/>
+                      <w:sz w:val="18"/>
+                      <w:szCs w:val="18"/>
+                    </w:rPr>
+                    <w:t xml:space="preserve"> Техническому регламенту о безопасности объектов </w:t>
+                  </w:r>
+                  <w:r>
+                    <w:rPr>
+                      <w:rFonts w:ascii="Times New Roman" w:hAnsi="Times New Roman" w:cs="Times New Roman"/>
+                      <w:sz w:val="18"/>
+                      <w:szCs w:val="18"/>
+                    </w:rPr>
+                    <w:t>внутреннего водного транспорта</w:t>
+                  </w:r>
+                  <w:r>
+                    <w:rPr>
+                      <w:rFonts w:ascii="Times New Roman" w:hAnsi="Times New Roman" w:cs="Times New Roman"/>
+                      <w:sz w:val="18"/>
+                      <w:szCs w:val="18"/>
+                    </w:rPr>
+                    <w:t xml:space="preserve">, утвержденному </w:t>
+                  </w:r>
+                  <w:r>
+                    <w:rPr>
+                      <w:rFonts w:ascii="Times New Roman" w:hAnsi="Times New Roman" w:cs="Times New Roman"/>
+                      <w:sz w:val="18"/>
+                      <w:szCs w:val="18"/>
+                    </w:rPr>
+                    <w:t>п</w:t>
+                  </w:r>
+                  <w:r>
+                    <w:rPr>
+                      <w:rFonts w:ascii="Times New Roman" w:hAnsi="Times New Roman" w:cs="Times New Roman"/>
+                      <w:sz w:val="18"/>
+                      <w:szCs w:val="18"/>
+                    </w:rPr>
+                    <w:t>остановлением Правительства Р</w:t>
+                  </w:r>
+                  <w:r>
+                    <w:rPr>
+                      <w:rFonts w:ascii="Times New Roman" w:hAnsi="Times New Roman" w:cs="Times New Roman"/>
+                      <w:sz w:val="18"/>
+                      <w:szCs w:val="18"/>
+                    </w:rPr>
+                    <w:t xml:space="preserve">оссийской </w:t>
+                  </w:r>
+                  <w:r>
+                    <w:rPr>
+                      <w:rFonts w:ascii="Times New Roman" w:hAnsi="Times New Roman" w:cs="Times New Roman"/>
+                      <w:sz w:val="18"/>
+                      <w:szCs w:val="18"/>
+                    </w:rPr>
+                    <w:t>Ф</w:t>
+                  </w:r>
+                  <w:r>
+                    <w:rPr>
+                      <w:rFonts w:ascii="Times New Roman" w:hAnsi="Times New Roman" w:cs="Times New Roman"/>
+                      <w:sz w:val="18"/>
+                      <w:szCs w:val="18"/>
+                    </w:rPr>
+                    <w:t>едерации</w:t>
+                  </w:r>
+                  <w:r>
+                    <w:rPr>
+                      <w:rFonts w:ascii="Times New Roman" w:hAnsi="Times New Roman" w:cs="Times New Roman"/>
+                      <w:sz w:val="18"/>
+                      <w:szCs w:val="18"/>
+                    </w:rPr>
+                    <w:t xml:space="preserve"> от </w:t>
+                  </w:r>
+                  <w:r>
+                    <w:rPr>
+                      <w:rFonts w:ascii="Times New Roman" w:hAnsi="Times New Roman" w:cs="Times New Roman"/>
+                      <w:sz w:val="18"/>
+                      <w:szCs w:val="18"/>
+                    </w:rPr>
+                    <w:t>17</w:t>
+                  </w:r>
+                  <w:r>
+                    <w:rPr>
+                      <w:rFonts w:ascii="Times New Roman" w:hAnsi="Times New Roman" w:cs="Times New Roman"/>
+                      <w:sz w:val="18"/>
+                      <w:szCs w:val="18"/>
+                    </w:rPr>
+                    <w:t>.0</w:t>
+                  </w:r>
+                  <w:r>
+                    <w:rPr>
+                      <w:rFonts w:ascii="Times New Roman" w:hAnsi="Times New Roman" w:cs="Times New Roman"/>
+                      <w:sz w:val="18"/>
+                      <w:szCs w:val="18"/>
+                    </w:rPr>
+                    <w:t>6</w:t>
+                  </w:r>
+                  <w:r>
+                    <w:rPr>
+                      <w:rFonts w:ascii="Times New Roman" w:hAnsi="Times New Roman" w:cs="Times New Roman"/>
+                      <w:sz w:val="18"/>
+                      <w:szCs w:val="18"/>
+                    </w:rPr>
+                    <w:t>.20</w:t>
+                  </w:r>
+                  <w:r>
+                    <w:rPr>
+                      <w:rFonts w:ascii="Times New Roman" w:hAnsi="Times New Roman" w:cs="Times New Roman"/>
+                      <w:sz w:val="18"/>
+                      <w:szCs w:val="18"/>
+                    </w:rPr>
+                    <w:t>25</w:t>
+                  </w:r>
+                  <w:r>
+                    <w:rPr>
+                      <w:rFonts w:ascii="Times New Roman" w:hAnsi="Times New Roman" w:cs="Times New Roman"/>
+                      <w:sz w:val="18"/>
+                      <w:szCs w:val="18"/>
+                    </w:rPr>
+                    <w:t xml:space="preserve"> №</w:t>
+                  </w:r>
+                  <w:r>
+                    <w:rPr>
+                      <w:rFonts w:ascii="Times New Roman" w:hAnsi="Times New Roman" w:cs="Times New Roman"/>
+                      <w:sz w:val="18"/>
+                      <w:szCs w:val="18"/>
+                    </w:rPr>
+                    <w:t xml:space="preserve"> 903</w:t>
+                  </w:r>
+                  <w:r>
+                    <w:rPr>
+                      <w:rFonts w:ascii="Times New Roman" w:hAnsi="Times New Roman" w:cs="Times New Roman"/>
+                      <w:sz w:val="18"/>
+                      <w:szCs w:val="18"/>
+                    </w:rPr>
+                    <w:t xml:space="preserve"> </w:t>
                   </w:r>
                 </w:p>
               </w:tc>
@@ -2431,7 +2912,39 @@
                 <w:sz w:val="18"/>
                 <w:szCs w:val="18"/>
               </w:rPr>
-              <w:t>Настоящим обязуемся предоставить необходимые условия и обеспечить выполнение правил охраны труда при проведении</w:t>
+              <w:t xml:space="preserve">Настоящим </w:t>
+            </w:r>
+            <w:r>
+              <w:rPr>
+                <w:rFonts w:ascii="Times New Roman" w:hAnsi="Times New Roman" w:cs="Times New Roman"/>
+                <w:sz w:val="18"/>
+                <w:szCs w:val="18"/>
+              </w:rPr>
+              <w:t xml:space="preserve">Заявитель </w:t>
+            </w:r>
+            <w:r>
+              <w:rPr>
+                <w:rFonts w:ascii="Times New Roman" w:hAnsi="Times New Roman" w:cs="Times New Roman"/>
+                <w:sz w:val="18"/>
+                <w:szCs w:val="18"/>
+              </w:rPr>
+              <w:t>обязуе</w:t>
+            </w:r>
+            <w:r>
+              <w:rPr>
+                <w:rFonts w:ascii="Times New Roman" w:hAnsi="Times New Roman" w:cs="Times New Roman"/>
+                <w:sz w:val="18"/>
+                <w:szCs w:val="18"/>
+              </w:rPr>
+              <w:t>т</w:t>
+            </w:r>
+            <w:r>
+              <w:rPr>
+                <w:rFonts w:ascii="Times New Roman" w:hAnsi="Times New Roman" w:cs="Times New Roman"/>
+                <w:sz w:val="18"/>
+                <w:szCs w:val="18"/>
+              </w:rPr>
+              <w:t>ся предоставить необходимые условия и обеспечить выполнение правил охраны труда при проведении</w:t>
             </w:r>
             <w:r>
               <w:rPr>
@@ -2474,7 +2987,87 @@
                 <w:sz w:val="18"/>
                 <w:szCs w:val="18"/>
               </w:rPr>
-              <w:t>Заявитель несет ответственность и гарантирует, что предоставленные Регистру сведения и документы в отношении объекта освидетельствования, указанного в п. 1, являются полными, точными и достоверными. В случае, если указанные сведения и документы окажутся ложными, недостоверными и (или) неточными, Заявитель обязан возместить Регистру прямые, документально подтвержденные, и/или косвенные убытки, возникшие в результате или в связи с недостоверностью или неточностью таких сведений, не позднее 10 (десяти) рабочих дней со дня получения требования от Регистра. При этом Регистр вправе отказаться от исполнения Договора в одностороннем (внесудебном) порядке.</w:t>
+              <w:t>Заявитель несет ответственность и гарантирует, что предоставленные Регистру сведения и документы в отношении объекта</w:t>
+            </w:r>
+            <w:r>
+              <w:rPr>
+                <w:rFonts w:ascii="Times New Roman" w:hAnsi="Times New Roman" w:cs="Times New Roman"/>
+                <w:sz w:val="18"/>
+                <w:szCs w:val="18"/>
+              </w:rPr>
+              <w:t xml:space="preserve"> оказания услуг</w:t>
+            </w:r>
+            <w:r>
+              <w:rPr>
+                <w:rFonts w:ascii="Times New Roman" w:hAnsi="Times New Roman" w:cs="Times New Roman"/>
+                <w:sz w:val="18"/>
+                <w:szCs w:val="18"/>
+              </w:rPr>
+              <w:t>, указанного в п. 1</w:t>
+            </w:r>
+            <w:r>
+              <w:rPr>
+                <w:rFonts w:ascii="Times New Roman" w:hAnsi="Times New Roman" w:cs="Times New Roman"/>
+                <w:sz w:val="18"/>
+                <w:szCs w:val="18"/>
+              </w:rPr>
+              <w:t xml:space="preserve"> настоящего договора-заявки</w:t>
+            </w:r>
+            <w:r>
+              <w:rPr>
+                <w:rFonts w:ascii="Times New Roman" w:hAnsi="Times New Roman" w:cs="Times New Roman"/>
+                <w:sz w:val="18"/>
+                <w:szCs w:val="18"/>
+              </w:rPr>
+              <w:t>, являются полными, точными и достоверными. В случае, если указанные сведения и документы окажутся ложными, недостоверными и (или) неточными, Заявитель обязан возместить Регистру прямые, документально подтвержденные, и/или косвенные убытки, возникшие в результате или в связи с недостоверностью или неточностью таких сведений</w:t>
+            </w:r>
+            <w:r>
+              <w:rPr>
+                <w:rFonts w:ascii="Times New Roman" w:hAnsi="Times New Roman" w:cs="Times New Roman"/>
+                <w:sz w:val="18"/>
+                <w:szCs w:val="18"/>
+              </w:rPr>
+              <w:t xml:space="preserve"> и документов</w:t>
+            </w:r>
+            <w:r>
+              <w:rPr>
+                <w:rFonts w:ascii="Times New Roman" w:hAnsi="Times New Roman" w:cs="Times New Roman"/>
+                <w:sz w:val="18"/>
+                <w:szCs w:val="18"/>
+              </w:rPr>
+              <w:t xml:space="preserve">, не позднее 10 (десяти) рабочих дней со дня получения требования от Регистра. При этом Регистр вправе отказаться от исполнения </w:t>
+            </w:r>
+            <w:r>
+              <w:rPr>
+                <w:rFonts w:ascii="Times New Roman" w:hAnsi="Times New Roman" w:cs="Times New Roman"/>
+                <w:sz w:val="18"/>
+                <w:szCs w:val="18"/>
+              </w:rPr>
+              <w:t>настоящего д</w:t>
+            </w:r>
+            <w:r>
+              <w:rPr>
+                <w:rFonts w:ascii="Times New Roman" w:hAnsi="Times New Roman" w:cs="Times New Roman"/>
+                <w:sz w:val="18"/>
+                <w:szCs w:val="18"/>
+              </w:rPr>
+              <w:t>оговора</w:t>
+            </w:r>
+            <w:r>
+              <w:rPr>
+                <w:rFonts w:ascii="Times New Roman" w:hAnsi="Times New Roman" w:cs="Times New Roman"/>
+                <w:sz w:val="18"/>
+                <w:szCs w:val="18"/>
+              </w:rPr>
+              <w:t>-заявки</w:t>
+            </w:r>
+            <w:r>
+              <w:rPr>
+                <w:rFonts w:ascii="Times New Roman" w:hAnsi="Times New Roman" w:cs="Times New Roman"/>
+                <w:sz w:val="18"/>
+                <w:szCs w:val="18"/>
+              </w:rPr>
+              <w:t xml:space="preserve"> в одностороннем (внесудебном) порядке.</w:t>
             </w:r>
           </w:p>
         </w:tc>
@@ -2516,7 +3109,31 @@
                 <w:sz w:val="18"/>
                 <w:szCs w:val="18"/>
               </w:rPr>
-              <w:t>Ориентировочное место и дата начала освидетельствования (</w:t>
+              <w:t xml:space="preserve">Ориентировочное место и дата начала </w:t>
+            </w:r>
+            <w:r>
+              <w:rPr>
+                <w:rFonts w:ascii="Times New Roman" w:hAnsi="Times New Roman" w:cs="Times New Roman"/>
+                <w:sz w:val="18"/>
+                <w:szCs w:val="18"/>
+              </w:rPr>
+              <w:t>оказания услуг</w:t>
+            </w:r>
+            <w:r>
+              <w:rPr>
+                <w:rFonts w:ascii="Times New Roman" w:hAnsi="Times New Roman" w:cs="Times New Roman"/>
+                <w:sz w:val="18"/>
+                <w:szCs w:val="18"/>
+              </w:rPr>
+              <w:t xml:space="preserve"> </w:t>
+            </w:r>
+            <w:r>
+              <w:rPr>
+                <w:rFonts w:ascii="Times New Roman" w:hAnsi="Times New Roman" w:cs="Times New Roman"/>
+                <w:sz w:val="18"/>
+                <w:szCs w:val="18"/>
+              </w:rPr>
+              <w:t>(</w:t>
             </w:r>
             <w:r>
               <w:rPr>
@@ -2632,16 +3249,7 @@
                 <w:szCs w:val="18"/>
                 <w:u w:val="single"/>
               </w:rPr>
-              <w:t xml:space="preserve"> }</w:t>
-            </w:r>
-            <w:r>
-              <w:rPr>
-                <w:rFonts w:ascii="Times New Roman" w:hAnsi="Times New Roman" w:cs="Times New Roman"/>
-                <w:sz w:val="18"/>
-                <w:szCs w:val="18"/>
-                <w:u w:val="single"/>
-              </w:rPr>
-              <w:t>}</w:t>
+              <w:t xml:space="preserve"> }}</w:t>
             </w:r>
             <w:r>
               <w:rPr>
@@ -2665,6 +3273,7 @@
               <w:jc w:val="both"/>
               <w:rPr>
                 <w:rFonts w:ascii="Times New Roman" w:hAnsi="Times New Roman" w:cs="Times New Roman"/>
+                <w:i/>
                 <w:sz w:val="18"/>
                 <w:szCs w:val="18"/>
               </w:rPr>
@@ -2686,28 +3295,207 @@
               <w:t>. </w:t>
             </w:r>
             <w:r>
-              <w:rPr>
-                <w:rFonts w:ascii="Times New Roman" w:hAnsi="Times New Roman" w:cs="Times New Roman"/>
-                <w:sz w:val="18"/>
-                <w:szCs w:val="18"/>
-              </w:rPr>
-              <w:t xml:space="preserve">Оплату оказанных услуг </w:t>
-            </w:r>
-            <w:r>
-              <w:rPr>
-                <w:rFonts w:ascii="Times New Roman" w:hAnsi="Times New Roman" w:cs="Times New Roman"/>
-                <w:sz w:val="18"/>
-                <w:szCs w:val="18"/>
-              </w:rPr>
-              <w:t xml:space="preserve">в соответствии с положениями Общих условий оказания услуг Регистром </w:t>
-            </w:r>
-            <w:r>
-              <w:rPr>
-                <w:rFonts w:ascii="Times New Roman" w:hAnsi="Times New Roman" w:cs="Times New Roman"/>
-                <w:sz w:val="18"/>
-                <w:szCs w:val="18"/>
-              </w:rPr>
-              <w:t>гарантируем.</w:t>
+              <w:t xml:space="preserve"> </w:t>
+            </w:r>
+            <w:r>
+              <w:rPr>
+                <w:rFonts w:ascii="Times New Roman" w:hAnsi="Times New Roman" w:cs="Times New Roman"/>
+                <w:sz w:val="18"/>
+                <w:szCs w:val="18"/>
+              </w:rPr>
+              <w:t>Стоимость услуг Регистра определяется в соответствии с утвержденными в установленном порядке документами о правилах ценообразования на услуги Регистра и составляет</w:t>
+            </w:r>
+            <w:r>
+              <w:rPr>
+                <w:rFonts w:ascii="Times New Roman" w:hAnsi="Times New Roman" w:cs="Times New Roman"/>
+                <w:sz w:val="18"/>
+                <w:szCs w:val="18"/>
+              </w:rPr>
+              <w:t xml:space="preserve"> </w:t>
+            </w:r>
+            <w:proofErr w:type="gramStart"/>
+            <w:r>
+              <w:rPr>
+                <w:rFonts w:ascii="Times New Roman" w:hAnsi="Times New Roman" w:cs="Times New Roman"/>
+                <w:sz w:val="18"/>
+                <w:szCs w:val="18"/>
+                <w:u w:val="single"/>
+              </w:rPr>
+              <w:t xml:space="preserve">{{ </w:t>
+            </w:r>
+            <w:r>
+              <w:rPr>
+                <w:rFonts w:ascii="Times New Roman" w:hAnsi="Times New Roman" w:cs="Times New Roman"/>
+                <w:sz w:val="18"/>
+                <w:szCs w:val="18"/>
+                <w:u w:val="single"/>
+                <w:lang w:val="en-US"/>
+              </w:rPr>
+              <w:t>short</w:t>
+            </w:r>
+            <w:proofErr w:type="gramEnd"/>
+            <w:r>
+              <w:rPr>
+                <w:rFonts w:ascii="Times New Roman" w:hAnsi="Times New Roman" w:cs="Times New Roman"/>
+                <w:sz w:val="18"/>
+                <w:szCs w:val="18"/>
+                <w:u w:val="single"/>
+              </w:rPr>
+              <w:t>_</w:t>
+            </w:r>
+            <w:proofErr w:type="gramStart"/>
+            <w:r>
+              <w:rPr>
+                <w:rFonts w:ascii="Times New Roman" w:hAnsi="Times New Roman" w:cs="Times New Roman"/>
+                <w:sz w:val="18"/>
+                <w:szCs w:val="18"/>
+                <w:u w:val="single"/>
+                <w:lang w:val="en-US"/>
+              </w:rPr>
+              <w:t>total</w:t>
+            </w:r>
+            <w:r>
+              <w:rPr>
+                <w:rFonts w:ascii="Times New Roman" w:hAnsi="Times New Roman" w:cs="Times New Roman"/>
+                <w:sz w:val="18"/>
+                <w:szCs w:val="18"/>
+                <w:u w:val="single"/>
+              </w:rPr>
+              <w:t xml:space="preserve"> }</w:t>
+            </w:r>
+            <w:proofErr w:type="gramEnd"/>
+            <w:r>
+              <w:rPr>
+                <w:rFonts w:ascii="Times New Roman" w:hAnsi="Times New Roman" w:cs="Times New Roman"/>
+                <w:sz w:val="18"/>
+                <w:szCs w:val="18"/>
+                <w:u w:val="single"/>
+              </w:rPr>
+              <w:t>}</w:t>
+            </w:r>
+            <w:r>
+              <w:rPr>
+                <w:rFonts w:ascii="Times New Roman" w:hAnsi="Times New Roman" w:cs="Times New Roman"/>
+                <w:sz w:val="18"/>
+                <w:szCs w:val="18"/>
+              </w:rPr>
+              <w:t xml:space="preserve"> </w:t>
+            </w:r>
+            <w:r>
+              <w:rPr>
+                <w:rFonts w:ascii="Times New Roman" w:hAnsi="Times New Roman" w:cs="Times New Roman"/>
+                <w:i/>
+                <w:sz w:val="18"/>
+                <w:szCs w:val="18"/>
+              </w:rPr>
+              <w:t xml:space="preserve">НДС не облагается </w:t>
+            </w:r>
+            <w:r>
+              <w:rPr>
+                <w:rFonts w:ascii="Times New Roman" w:hAnsi="Times New Roman" w:cs="Times New Roman"/>
+                <w:i/>
+                <w:sz w:val="18"/>
+                <w:szCs w:val="18"/>
+              </w:rPr>
+              <w:t>(</w:t>
+            </w:r>
+            <w:r>
+              <w:rPr>
+                <w:rFonts w:ascii="Times New Roman" w:hAnsi="Times New Roman" w:cs="Times New Roman"/>
+                <w:i/>
+                <w:sz w:val="18"/>
+                <w:szCs w:val="18"/>
+              </w:rPr>
+              <w:t>в соответствии с</w:t>
+            </w:r>
+            <w:r>
+              <w:rPr>
+                <w:rFonts w:ascii="Times New Roman" w:hAnsi="Times New Roman" w:cs="Times New Roman"/>
+                <w:i/>
+                <w:sz w:val="18"/>
+                <w:szCs w:val="18"/>
+              </w:rPr>
+              <w:t xml:space="preserve"> </w:t>
+            </w:r>
+            <w:proofErr w:type="spellStart"/>
+            <w:r>
+              <w:rPr>
+                <w:rFonts w:ascii="Times New Roman" w:hAnsi="Times New Roman" w:cs="Times New Roman"/>
+                <w:i/>
+                <w:sz w:val="18"/>
+                <w:szCs w:val="18"/>
+              </w:rPr>
+              <w:t>пп</w:t>
+            </w:r>
+            <w:proofErr w:type="spellEnd"/>
+            <w:r>
+              <w:rPr>
+                <w:rFonts w:ascii="Times New Roman" w:hAnsi="Times New Roman" w:cs="Times New Roman"/>
+                <w:i/>
+                <w:sz w:val="18"/>
+                <w:szCs w:val="18"/>
+              </w:rPr>
+              <w:t>. 23 п. 2 ст. 149 НК РФ)</w:t>
+            </w:r>
+            <w:r>
+              <w:rPr>
+                <w:rFonts w:ascii="Times New Roman" w:hAnsi="Times New Roman" w:cs="Times New Roman"/>
+                <w:i/>
+                <w:sz w:val="18"/>
+                <w:szCs w:val="18"/>
+              </w:rPr>
+              <w:t>.</w:t>
+            </w:r>
+            <w:r>
+              <w:rPr>
+                <w:rFonts w:ascii="Times New Roman" w:hAnsi="Times New Roman" w:cs="Times New Roman"/>
+                <w:i/>
+                <w:sz w:val="18"/>
+                <w:szCs w:val="18"/>
+              </w:rPr>
+              <w:t xml:space="preserve"> </w:t>
+            </w:r>
+          </w:p>
+          <w:p>
+            <w:pPr>
+              <w:jc w:val="both"/>
+              <w:rPr>
+                <w:rFonts w:ascii="Times New Roman" w:hAnsi="Times New Roman" w:cs="Times New Roman"/>
+                <w:sz w:val="18"/>
+                <w:szCs w:val="18"/>
+              </w:rPr>
+            </w:pPr>
+            <w:r>
+              <w:rPr>
+                <w:rFonts w:ascii="Times New Roman" w:hAnsi="Times New Roman" w:cs="Times New Roman"/>
+                <w:sz w:val="18"/>
+                <w:szCs w:val="18"/>
+              </w:rPr>
+              <w:t>Заявитель гарантирует о</w:t>
+            </w:r>
+            <w:r>
+              <w:rPr>
+                <w:rFonts w:ascii="Times New Roman" w:hAnsi="Times New Roman" w:cs="Times New Roman"/>
+                <w:sz w:val="18"/>
+                <w:szCs w:val="18"/>
+              </w:rPr>
+              <w:t xml:space="preserve">плату оказанных услуг </w:t>
+            </w:r>
+            <w:r>
+              <w:rPr>
+                <w:rFonts w:ascii="Times New Roman" w:hAnsi="Times New Roman" w:cs="Times New Roman"/>
+                <w:sz w:val="18"/>
+                <w:szCs w:val="18"/>
+              </w:rPr>
+              <w:t>в соответствии с положениями Общих условий оказания услуг Регистром</w:t>
+            </w:r>
+            <w:r>
+              <w:rPr>
+                <w:rFonts w:ascii="Times New Roman" w:hAnsi="Times New Roman" w:cs="Times New Roman"/>
+                <w:sz w:val="18"/>
+                <w:szCs w:val="18"/>
+              </w:rPr>
+              <w:t>.</w:t>
             </w:r>
           </w:p>
         </w:tc>
@@ -2788,7 +3576,7 @@
                 <w:sz w:val="18"/>
                 <w:szCs w:val="18"/>
               </w:rPr>
-              <w:t xml:space="preserve">                                        </w:t>
+              <w:t xml:space="preserve">                                              </w:t>
             </w:r>
           </w:p>
           <w:p>
@@ -2822,15 +3610,15 @@
                 <w:sz w:val="18"/>
                 <w:szCs w:val="18"/>
               </w:rPr>
-              <w:t xml:space="preserve">Срок исполнения обязательств сторонами: </w:t>
-            </w:r>
-            <w:r>
-              <w:rPr>
-                <w:rFonts w:ascii="Times New Roman" w:hAnsi="Times New Roman" w:cs="Times New Roman"/>
-                <w:sz w:val="18"/>
-                <w:szCs w:val="18"/>
-              </w:rPr>
-              <w:t>---</w:t>
+              <w:t>Срок исполнения обязательств сторонами:</w:t>
+            </w:r>
+            <w:r>
+              <w:rPr>
+                <w:rFonts w:ascii="Times New Roman" w:hAnsi="Times New Roman" w:cs="Times New Roman"/>
+                <w:sz w:val="18"/>
+                <w:szCs w:val="18"/>
+              </w:rPr>
+              <w:t xml:space="preserve"> ---</w:t>
             </w:r>
             <w:r>
               <w:rPr>
@@ -2922,7 +3710,39 @@
                 <w:sz w:val="18"/>
                 <w:szCs w:val="18"/>
               </w:rPr>
-              <w:t>С Общими условиями оказания услуг Регистром ознакомлены и согласны (</w:t>
+              <w:t xml:space="preserve">С Общими условиями оказания услуг Регистром </w:t>
+            </w:r>
+            <w:r>
+              <w:rPr>
+                <w:rFonts w:ascii="Times New Roman" w:hAnsi="Times New Roman" w:cs="Times New Roman"/>
+                <w:sz w:val="18"/>
+                <w:szCs w:val="18"/>
+              </w:rPr>
+              <w:t xml:space="preserve">Заявитель </w:t>
+            </w:r>
+            <w:r>
+              <w:rPr>
+                <w:rFonts w:ascii="Times New Roman" w:hAnsi="Times New Roman" w:cs="Times New Roman"/>
+                <w:sz w:val="18"/>
+                <w:szCs w:val="18"/>
+              </w:rPr>
+              <w:t>ознакомлен и соглас</w:t>
+            </w:r>
+            <w:r>
+              <w:rPr>
+                <w:rFonts w:ascii="Times New Roman" w:hAnsi="Times New Roman" w:cs="Times New Roman"/>
+                <w:sz w:val="18"/>
+                <w:szCs w:val="18"/>
+              </w:rPr>
+              <w:t>е</w:t>
+            </w:r>
+            <w:r>
+              <w:rPr>
+                <w:rFonts w:ascii="Times New Roman" w:hAnsi="Times New Roman" w:cs="Times New Roman"/>
+                <w:sz w:val="18"/>
+                <w:szCs w:val="18"/>
+              </w:rPr>
+              <w:t>н (</w:t>
             </w:r>
             <w:hyperlink r:id="rId8" w:history="1">
               <w:r>
@@ -3083,7 +3903,23 @@
                 <w:sz w:val="18"/>
                 <w:szCs w:val="18"/>
               </w:rPr>
-              <w:t>Лицо, указанное в настоящем договоре-заявке, согласно с обработкой персональных данных Регистром для исполнения договора-заявки.</w:t>
+              <w:t>З</w:t>
+            </w:r>
+            <w:r>
+              <w:rPr>
+                <w:rFonts w:ascii="Times New Roman" w:hAnsi="Times New Roman" w:cs="Times New Roman"/>
+                <w:sz w:val="18"/>
+                <w:szCs w:val="18"/>
+              </w:rPr>
+              <w:t>аявитель</w:t>
+            </w:r>
+            <w:r>
+              <w:rPr>
+                <w:rFonts w:ascii="Times New Roman" w:hAnsi="Times New Roman" w:cs="Times New Roman"/>
+                <w:sz w:val="18"/>
+                <w:szCs w:val="18"/>
+              </w:rPr>
+              <w:t xml:space="preserve"> подтверждает, что им получено согласие физических лиц, привлеченных к исполнению настоящего договора-заявки тем или иным способом, на обработку их персональных данных, позволяющее включать такие персональные данные в текст настоящего договора-заявки, передавать их РС, а также обрабатывать их иными способами, необходимыми для реализации прав и выполнения обязанностей Сторонами по настоящему договору-заявке.</w:t>
             </w:r>
           </w:p>
         </w:tc>
@@ -3411,8 +4247,8 @@
             <w:pPr>
               <w:rPr>
                 <w:rFonts w:ascii="Times New Roman" w:hAnsi="Times New Roman" w:cs="Times New Roman"/>
-                <w:sz w:val="18"/>
-                <w:szCs w:val="18"/>
+                <w:sz w:val="10"/>
+                <w:szCs w:val="10"/>
                 <w:lang w:val="en-US"/>
               </w:rPr>
             </w:pPr>
@@ -3426,8 +4262,8 @@
             <w:pPr>
               <w:rPr>
                 <w:rFonts w:ascii="Times New Roman" w:hAnsi="Times New Roman" w:cs="Times New Roman"/>
-                <w:sz w:val="18"/>
-                <w:szCs w:val="18"/>
+                <w:sz w:val="10"/>
+                <w:szCs w:val="10"/>
                 <w:lang w:val="en-US"/>
               </w:rPr>
             </w:pPr>
@@ -3446,8 +4282,8 @@
             <w:pPr>
               <w:rPr>
                 <w:rFonts w:ascii="Times New Roman" w:hAnsi="Times New Roman" w:cs="Times New Roman"/>
-                <w:sz w:val="18"/>
-                <w:szCs w:val="18"/>
+                <w:sz w:val="10"/>
+                <w:szCs w:val="10"/>
                 <w:lang w:val="en-US"/>
               </w:rPr>
             </w:pPr>
@@ -3460,50 +4296,6 @@
             <w:tcW w:w="2540" w:type="pct"/>
             <w:gridSpan w:val="9"/>
           </w:tcPr>
-          <w:p>
-            <w:pPr>
-              <w:rPr>
-                <w:rFonts w:ascii="Times New Roman" w:hAnsi="Times New Roman" w:cs="Times New Roman"/>
-                <w:sz w:val="18"/>
-                <w:szCs w:val="18"/>
-                <w:lang w:val="en-US"/>
-              </w:rPr>
-            </w:pPr>
-            <w:r>
-              <w:rPr>
-                <w:rFonts w:ascii="Times New Roman" w:hAnsi="Times New Roman" w:cs="Times New Roman"/>
-                <w:sz w:val="18"/>
-                <w:szCs w:val="18"/>
-              </w:rPr>
-              <w:t>Почтовый</w:t>
-            </w:r>
-            <w:r>
-              <w:rPr>
-                <w:rFonts w:ascii="Times New Roman" w:hAnsi="Times New Roman" w:cs="Times New Roman"/>
-                <w:sz w:val="18"/>
-                <w:szCs w:val="18"/>
-                <w:lang w:val="en-US"/>
-              </w:rPr>
-              <w:t xml:space="preserve"> </w:t>
-            </w:r>
-            <w:r>
-              <w:rPr>
-                <w:rFonts w:ascii="Times New Roman" w:hAnsi="Times New Roman" w:cs="Times New Roman"/>
-                <w:sz w:val="18"/>
-                <w:szCs w:val="18"/>
-              </w:rPr>
-              <w:t>адрес</w:t>
-            </w:r>
-            <w:r>
-              <w:rPr>
-                <w:rFonts w:ascii="Times New Roman" w:hAnsi="Times New Roman" w:cs="Times New Roman"/>
-                <w:sz w:val="18"/>
-                <w:szCs w:val="18"/>
-                <w:lang w:val="en-US"/>
-              </w:rPr>
-              <w:t>:</w:t>
-            </w:r>
-          </w:p>
           <w:p>
             <w:pPr>
               <w:rPr>
@@ -3680,8 +4472,8 @@
             <w:pPr>
               <w:rPr>
                 <w:rFonts w:ascii="Times New Roman" w:hAnsi="Times New Roman" w:cs="Times New Roman"/>
-                <w:sz w:val="18"/>
-                <w:szCs w:val="18"/>
+                <w:sz w:val="10"/>
+                <w:szCs w:val="10"/>
               </w:rPr>
             </w:pPr>
           </w:p>
@@ -3698,8 +4490,8 @@
             <w:pPr>
               <w:rPr>
                 <w:rFonts w:ascii="Times New Roman" w:hAnsi="Times New Roman" w:cs="Times New Roman"/>
-                <w:sz w:val="18"/>
-                <w:szCs w:val="18"/>
+                <w:sz w:val="10"/>
+                <w:szCs w:val="10"/>
               </w:rPr>
             </w:pPr>
           </w:p>
@@ -4615,25 +5407,14 @@
                 <w:lang w:val="en-US"/>
               </w:rPr>
             </w:pPr>
-            <w:proofErr w:type="gramStart"/>
-            <w:r>
-              <w:rPr>
-                <w:rFonts w:ascii="Times New Roman" w:hAnsi="Times New Roman" w:cs="Times New Roman"/>
-                <w:sz w:val="18"/>
-                <w:szCs w:val="18"/>
-                <w:lang w:val="en-US"/>
-              </w:rPr>
-              <w:t>{{ email</w:t>
-            </w:r>
-            <w:proofErr w:type="gramEnd"/>
-            <w:r>
-              <w:rPr>
-                <w:rFonts w:ascii="Times New Roman" w:hAnsi="Times New Roman" w:cs="Times New Roman"/>
-                <w:sz w:val="18"/>
-                <w:szCs w:val="18"/>
-                <w:lang w:val="en-US"/>
-              </w:rPr>
-              <w:t xml:space="preserve"> }}</w:t>
+            <w:r>
+              <w:rPr>
+                <w:rFonts w:ascii="Times New Roman" w:hAnsi="Times New Roman" w:cs="Times New Roman"/>
+                <w:sz w:val="18"/>
+                <w:szCs w:val="18"/>
+                <w:lang w:val="en-US"/>
+              </w:rPr>
+              <w:t>{{ email }}</w:t>
             </w:r>
           </w:p>
         </w:tc>
@@ -5222,6 +6003,7 @@
                 <w:sz w:val="18"/>
                 <w:szCs w:val="20"/>
               </w:rPr>
+              <w:lastRenderedPageBreak/>
               <w:t>действующий на основании</w:t>
             </w:r>
           </w:p>
@@ -5403,6 +6185,7 @@
           </w:tcPr>
           <w:p>
             <w:pPr>
+              <w:jc w:val="center"/>
               <w:rPr>
                 <w:rFonts w:ascii="Times New Roman" w:hAnsi="Times New Roman" w:cs="Times New Roman"/>
                 <w:sz w:val="20"/>
@@ -5512,6 +6295,7 @@
           </w:tcPr>
           <w:p>
             <w:pPr>
+              <w:jc w:val="center"/>
               <w:rPr>
                 <w:rFonts w:ascii="Times New Roman" w:hAnsi="Times New Roman" w:cs="Times New Roman"/>
                 <w:sz w:val="20"/>
@@ -5789,7 +6573,12 @@
       </w:pPr>
     </w:p>
     <w:sectPr>
-      <w:headerReference w:type="default" r:id="rId9"/>
+      <w:headerReference w:type="even" r:id="rId9"/>
+      <w:headerReference w:type="default" r:id="rId10"/>
+      <w:footerReference w:type="even" r:id="rId11"/>
+      <w:footerReference w:type="default" r:id="rId12"/>
+      <w:headerReference w:type="first" r:id="rId13"/>
+      <w:footerReference w:type="first" r:id="rId14"/>
       <w:pgSz w:w="11906" w:h="16838" w:code="9"/>
       <w:pgMar w:top="1134" w:right="567" w:bottom="142" w:left="1134" w:header="397" w:footer="227" w:gutter="0"/>
       <w:cols w:space="708"/>
@@ -5822,6 +6611,36 @@
     </w:p>
   </w:endnote>
 </w:endnotes>
+</file>
+
+<file path=word/footer1.xml><?xml version="1.0" encoding="utf-8"?>
+<w:ftr xmlns:wpc="http://schemas.microsoft.com/office/word/2010/wordprocessingCanvas" xmlns:cx="http://schemas.microsoft.com/office/drawing/2014/chartex" xmlns:cx1="http://schemas.microsoft.com/office/drawing/2015/9/8/chartex" xmlns:cx2="http://schemas.microsoft.com/office/drawing/2015/10/21/chartex" xmlns:cx3="http://schemas.microsoft.com/office/drawing/2016/5/9/chartex" xmlns:cx4="http://schemas.microsoft.com/office/drawing/2016/5/10/chartex" xmlns:cx5="http://schemas.microsoft.com/office/drawing/2016/5/11/chartex" xmlns:cx6="http://schemas.microsoft.com/office/drawing/2016/5/12/chartex" xmlns:cx7="http://schemas.microsoft.com/office/drawing/2016/5/13/chartex" xmlns:cx8="http://schemas.microsoft.com/office/drawing/2016/5/14/chartex" xmlns:mc="http://schemas.openxmlformats.org/markup-compatibility/2006" xmlns:aink="http://schemas.microsoft.com/office/drawing/2016/ink" xmlns:am3d="http://schemas.microsoft.com/office/drawing/2017/model3d" xmlns:o="urn:schemas-microsoft-com:office:office" xmlns:oel="http://schemas.microsoft.com/office/2019/extlst" xmlns:r="http://schemas.openxmlformats.org/officeDocument/2006/relationships" xmlns:m="http://schemas.openxmlformats.org/officeDocument/2006/math" xmlns:v="urn:schemas-microsoft-com:vml" xmlns:wp14="http://schemas.microsoft.com/office/word/2010/wordprocessingDrawing" xmlns:wp="http://schemas.openxmlformats.org/drawingml/2006/wordprocessingDrawing" xmlns:w10="urn:schemas-microsoft-com:office:word" xmlns:w="http://schemas.openxmlformats.org/wordprocessingml/2006/main" xmlns:w14="http://schemas.microsoft.com/office/word/2010/wordml" xmlns:w15="http://schemas.microsoft.com/office/word/2012/wordml" xmlns:w16cex="http://schemas.microsoft.com/office/word/2018/wordml/cex" xmlns:w16cid="http://schemas.microsoft.com/office/word/2016/wordml/cid" xmlns:w16="http://schemas.microsoft.com/office/word/2018/wordml" xmlns:w16du="http://schemas.microsoft.com/office/word/2023/wordml/word16du" xmlns:w16sdtdh="http://schemas.microsoft.com/office/word/2020/wordml/sdtdatahash" xmlns:w16sdtfl="http://schemas.microsoft.com/office/word/2024/wordml/sdtformatlock" xmlns:w16se="http://schemas.microsoft.com/office/word/2015/wordml/symex" xmlns:wpg="http://schemas.microsoft.com/office/word/2010/wordprocessingGroup" xmlns:wpi="http://schemas.microsoft.com/office/word/2010/wordprocessingInk" xmlns:wne="http://schemas.microsoft.com/office/word/2006/wordml" xmlns:wps="http://schemas.microsoft.com/office/word/2010/wordprocessingShape" mc:Ignorable="w14 w15 w16se w16cid w16 w16cex w16sdtdh w16sdtfl w16du wp14">
+  <w:p>
+    <w:pPr>
+      <w:pStyle w:val="a7"/>
+    </w:pPr>
+  </w:p>
+</w:ftr>
+</file>
+
+<file path=word/footer2.xml><?xml version="1.0" encoding="utf-8"?>
+<w:ftr xmlns:wpc="http://schemas.microsoft.com/office/word/2010/wordprocessingCanvas" xmlns:cx="http://schemas.microsoft.com/office/drawing/2014/chartex" xmlns:cx1="http://schemas.microsoft.com/office/drawing/2015/9/8/chartex" xmlns:cx2="http://schemas.microsoft.com/office/drawing/2015/10/21/chartex" xmlns:cx3="http://schemas.microsoft.com/office/drawing/2016/5/9/chartex" xmlns:cx4="http://schemas.microsoft.com/office/drawing/2016/5/10/chartex" xmlns:cx5="http://schemas.microsoft.com/office/drawing/2016/5/11/chartex" xmlns:cx6="http://schemas.microsoft.com/office/drawing/2016/5/12/chartex" xmlns:cx7="http://schemas.microsoft.com/office/drawing/2016/5/13/chartex" xmlns:cx8="http://schemas.microsoft.com/office/drawing/2016/5/14/chartex" xmlns:mc="http://schemas.openxmlformats.org/markup-compatibility/2006" xmlns:aink="http://schemas.microsoft.com/office/drawing/2016/ink" xmlns:am3d="http://schemas.microsoft.com/office/drawing/2017/model3d" xmlns:o="urn:schemas-microsoft-com:office:office" xmlns:oel="http://schemas.microsoft.com/office/2019/extlst" xmlns:r="http://schemas.openxmlformats.org/officeDocument/2006/relationships" xmlns:m="http://schemas.openxmlformats.org/officeDocument/2006/math" xmlns:v="urn:schemas-microsoft-com:vml" xmlns:wp14="http://schemas.microsoft.com/office/word/2010/wordprocessingDrawing" xmlns:wp="http://schemas.openxmlformats.org/drawingml/2006/wordprocessingDrawing" xmlns:w10="urn:schemas-microsoft-com:office:word" xmlns:w="http://schemas.openxmlformats.org/wordprocessingml/2006/main" xmlns:w14="http://schemas.microsoft.com/office/word/2010/wordml" xmlns:w15="http://schemas.microsoft.com/office/word/2012/wordml" xmlns:w16cex="http://schemas.microsoft.com/office/word/2018/wordml/cex" xmlns:w16cid="http://schemas.microsoft.com/office/word/2016/wordml/cid" xmlns:w16="http://schemas.microsoft.com/office/word/2018/wordml" xmlns:w16du="http://schemas.microsoft.com/office/word/2023/wordml/word16du" xmlns:w16sdtdh="http://schemas.microsoft.com/office/word/2020/wordml/sdtdatahash" xmlns:w16sdtfl="http://schemas.microsoft.com/office/word/2024/wordml/sdtformatlock" xmlns:w16se="http://schemas.microsoft.com/office/word/2015/wordml/symex" xmlns:wpg="http://schemas.microsoft.com/office/word/2010/wordprocessingGroup" xmlns:wpi="http://schemas.microsoft.com/office/word/2010/wordprocessingInk" xmlns:wne="http://schemas.microsoft.com/office/word/2006/wordml" xmlns:wps="http://schemas.microsoft.com/office/word/2010/wordprocessingShape" mc:Ignorable="w14 w15 w16se w16cid w16 w16cex w16sdtdh w16sdtfl w16du wp14">
+  <w:p>
+    <w:pPr>
+      <w:pStyle w:val="a7"/>
+    </w:pPr>
+  </w:p>
+</w:ftr>
+</file>
+
+<file path=word/footer3.xml><?xml version="1.0" encoding="utf-8"?>
+<w:ftr xmlns:wpc="http://schemas.microsoft.com/office/word/2010/wordprocessingCanvas" xmlns:cx="http://schemas.microsoft.com/office/drawing/2014/chartex" xmlns:cx1="http://schemas.microsoft.com/office/drawing/2015/9/8/chartex" xmlns:cx2="http://schemas.microsoft.com/office/drawing/2015/10/21/chartex" xmlns:cx3="http://schemas.microsoft.com/office/drawing/2016/5/9/chartex" xmlns:cx4="http://schemas.microsoft.com/office/drawing/2016/5/10/chartex" xmlns:cx5="http://schemas.microsoft.com/office/drawing/2016/5/11/chartex" xmlns:cx6="http://schemas.microsoft.com/office/drawing/2016/5/12/chartex" xmlns:cx7="http://schemas.microsoft.com/office/drawing/2016/5/13/chartex" xmlns:cx8="http://schemas.microsoft.com/office/drawing/2016/5/14/chartex" xmlns:mc="http://schemas.openxmlformats.org/markup-compatibility/2006" xmlns:aink="http://schemas.microsoft.com/office/drawing/2016/ink" xmlns:am3d="http://schemas.microsoft.com/office/drawing/2017/model3d" xmlns:o="urn:schemas-microsoft-com:office:office" xmlns:oel="http://schemas.microsoft.com/office/2019/extlst" xmlns:r="http://schemas.openxmlformats.org/officeDocument/2006/relationships" xmlns:m="http://schemas.openxmlformats.org/officeDocument/2006/math" xmlns:v="urn:schemas-microsoft-com:vml" xmlns:wp14="http://schemas.microsoft.com/office/word/2010/wordprocessingDrawing" xmlns:wp="http://schemas.openxmlformats.org/drawingml/2006/wordprocessingDrawing" xmlns:w10="urn:schemas-microsoft-com:office:word" xmlns:w="http://schemas.openxmlformats.org/wordprocessingml/2006/main" xmlns:w14="http://schemas.microsoft.com/office/word/2010/wordml" xmlns:w15="http://schemas.microsoft.com/office/word/2012/wordml" xmlns:w16cex="http://schemas.microsoft.com/office/word/2018/wordml/cex" xmlns:w16cid="http://schemas.microsoft.com/office/word/2016/wordml/cid" xmlns:w16="http://schemas.microsoft.com/office/word/2018/wordml" xmlns:w16du="http://schemas.microsoft.com/office/word/2023/wordml/word16du" xmlns:w16sdtdh="http://schemas.microsoft.com/office/word/2020/wordml/sdtdatahash" xmlns:w16sdtfl="http://schemas.microsoft.com/office/word/2024/wordml/sdtformatlock" xmlns:w16se="http://schemas.microsoft.com/office/word/2015/wordml/symex" xmlns:wpg="http://schemas.microsoft.com/office/word/2010/wordprocessingGroup" xmlns:wpi="http://schemas.microsoft.com/office/word/2010/wordprocessingInk" xmlns:wne="http://schemas.microsoft.com/office/word/2006/wordml" xmlns:wps="http://schemas.microsoft.com/office/word/2010/wordprocessingShape" mc:Ignorable="w14 w15 w16se w16cid w16 w16cex w16sdtdh w16sdtfl w16du wp14">
+  <w:p>
+    <w:pPr>
+      <w:pStyle w:val="a7"/>
+    </w:pPr>
+  </w:p>
+</w:ftr>
 </file>
 
 <file path=word/footnotes.xml><?xml version="1.0" encoding="utf-8"?>
@@ -6050,6 +6869,16 @@
 </file>
 
 <file path=word/header1.xml><?xml version="1.0" encoding="utf-8"?>
+<w:hdr xmlns:wpc="http://schemas.microsoft.com/office/word/2010/wordprocessingCanvas" xmlns:cx="http://schemas.microsoft.com/office/drawing/2014/chartex" xmlns:cx1="http://schemas.microsoft.com/office/drawing/2015/9/8/chartex" xmlns:cx2="http://schemas.microsoft.com/office/drawing/2015/10/21/chartex" xmlns:cx3="http://schemas.microsoft.com/office/drawing/2016/5/9/chartex" xmlns:cx4="http://schemas.microsoft.com/office/drawing/2016/5/10/chartex" xmlns:cx5="http://schemas.microsoft.com/office/drawing/2016/5/11/chartex" xmlns:cx6="http://schemas.microsoft.com/office/drawing/2016/5/12/chartex" xmlns:cx7="http://schemas.microsoft.com/office/drawing/2016/5/13/chartex" xmlns:cx8="http://schemas.microsoft.com/office/drawing/2016/5/14/chartex" xmlns:mc="http://schemas.openxmlformats.org/markup-compatibility/2006" xmlns:aink="http://schemas.microsoft.com/office/drawing/2016/ink" xmlns:am3d="http://schemas.microsoft.com/office/drawing/2017/model3d" xmlns:o="urn:schemas-microsoft-com:office:office" xmlns:oel="http://schemas.microsoft.com/office/2019/extlst" xmlns:r="http://schemas.openxmlformats.org/officeDocument/2006/relationships" xmlns:m="http://schemas.openxmlformats.org/officeDocument/2006/math" xmlns:v="urn:schemas-microsoft-com:vml" xmlns:wp14="http://schemas.microsoft.com/office/word/2010/wordprocessingDrawing" xmlns:wp="http://schemas.openxmlformats.org/drawingml/2006/wordprocessingDrawing" xmlns:w10="urn:schemas-microsoft-com:office:word" xmlns:w="http://schemas.openxmlformats.org/wordprocessingml/2006/main" xmlns:w14="http://schemas.microsoft.com/office/word/2010/wordml" xmlns:w15="http://schemas.microsoft.com/office/word/2012/wordml" xmlns:w16cex="http://schemas.microsoft.com/office/word/2018/wordml/cex" xmlns:w16cid="http://schemas.microsoft.com/office/word/2016/wordml/cid" xmlns:w16="http://schemas.microsoft.com/office/word/2018/wordml" xmlns:w16du="http://schemas.microsoft.com/office/word/2023/wordml/word16du" xmlns:w16sdtdh="http://schemas.microsoft.com/office/word/2020/wordml/sdtdatahash" xmlns:w16sdtfl="http://schemas.microsoft.com/office/word/2024/wordml/sdtformatlock" xmlns:w16se="http://schemas.microsoft.com/office/word/2015/wordml/symex" xmlns:wpg="http://schemas.microsoft.com/office/word/2010/wordprocessingGroup" xmlns:wpi="http://schemas.microsoft.com/office/word/2010/wordprocessingInk" xmlns:wne="http://schemas.microsoft.com/office/word/2006/wordml" xmlns:wps="http://schemas.microsoft.com/office/word/2010/wordprocessingShape" mc:Ignorable="w14 w15 w16se w16cid w16 w16cex w16sdtdh w16sdtfl w16du wp14">
+  <w:p>
+    <w:pPr>
+      <w:pStyle w:val="a5"/>
+    </w:pPr>
+  </w:p>
+</w:hdr>
+</file>
+
+<file path=word/header2.xml><?xml version="1.0" encoding="utf-8"?>
 <w:hdr xmlns:wpc="http://schemas.microsoft.com/office/word/2010/wordprocessingCanvas" xmlns:cx="http://schemas.microsoft.com/office/drawing/2014/chartex" xmlns:cx1="http://schemas.microsoft.com/office/drawing/2015/9/8/chartex" xmlns:cx2="http://schemas.microsoft.com/office/drawing/2015/10/21/chartex" xmlns:cx3="http://schemas.microsoft.com/office/drawing/2016/5/9/chartex" xmlns:cx4="http://schemas.microsoft.com/office/drawing/2016/5/10/chartex" xmlns:cx5="http://schemas.microsoft.com/office/drawing/2016/5/11/chartex" xmlns:cx6="http://schemas.microsoft.com/office/drawing/2016/5/12/chartex" xmlns:cx7="http://schemas.microsoft.com/office/drawing/2016/5/13/chartex" xmlns:cx8="http://schemas.microsoft.com/office/drawing/2016/5/14/chartex" xmlns:mc="http://schemas.openxmlformats.org/markup-compatibility/2006" xmlns:aink="http://schemas.microsoft.com/office/drawing/2016/ink" xmlns:am3d="http://schemas.microsoft.com/office/drawing/2017/model3d" xmlns:o="urn:schemas-microsoft-com:office:office" xmlns:oel="http://schemas.microsoft.com/office/2019/extlst" xmlns:r="http://schemas.openxmlformats.org/officeDocument/2006/relationships" xmlns:m="http://schemas.openxmlformats.org/officeDocument/2006/math" xmlns:v="urn:schemas-microsoft-com:vml" xmlns:wp14="http://schemas.microsoft.com/office/word/2010/wordprocessingDrawing" xmlns:wp="http://schemas.openxmlformats.org/drawingml/2006/wordprocessingDrawing" xmlns:w10="urn:schemas-microsoft-com:office:word" xmlns:w="http://schemas.openxmlformats.org/wordprocessingml/2006/main" xmlns:w14="http://schemas.microsoft.com/office/word/2010/wordml" xmlns:w15="http://schemas.microsoft.com/office/word/2012/wordml" xmlns:w16cex="http://schemas.microsoft.com/office/word/2018/wordml/cex" xmlns:w16cid="http://schemas.microsoft.com/office/word/2016/wordml/cid" xmlns:w16="http://schemas.microsoft.com/office/word/2018/wordml" xmlns:w16du="http://schemas.microsoft.com/office/word/2023/wordml/word16du" xmlns:w16sdtdh="http://schemas.microsoft.com/office/word/2020/wordml/sdtdatahash" xmlns:w16sdtfl="http://schemas.microsoft.com/office/word/2024/wordml/sdtformatlock" xmlns:w16se="http://schemas.microsoft.com/office/word/2015/wordml/symex" xmlns:wpg="http://schemas.microsoft.com/office/word/2010/wordprocessingGroup" xmlns:wpi="http://schemas.microsoft.com/office/word/2010/wordprocessingInk" xmlns:wne="http://schemas.microsoft.com/office/word/2006/wordml" xmlns:wps="http://schemas.microsoft.com/office/word/2010/wordprocessingShape" mc:Ignorable="w14 w15 w16se w16cid w16 w16cex w16sdtdh w16sdtfl w16du wp14">
   <w:tbl>
     <w:tblPr>
@@ -6203,15 +7032,7 @@
               <w:sz w:val="18"/>
               <w:szCs w:val="18"/>
             </w:rPr>
-            <w:t>0</w:t>
-          </w:r>
-          <w:r>
-            <w:rPr>
-              <w:rFonts w:ascii="Times New Roman" w:hAnsi="Times New Roman" w:cs="Times New Roman"/>
-              <w:sz w:val="18"/>
-              <w:szCs w:val="18"/>
-            </w:rPr>
-            <w:t>9</w:t>
+            <w:t>07</w:t>
           </w:r>
           <w:r>
             <w:rPr>
@@ -6235,9 +7056,8 @@
               <w:rFonts w:ascii="Times New Roman" w:hAnsi="Times New Roman" w:cs="Times New Roman"/>
               <w:sz w:val="18"/>
               <w:szCs w:val="18"/>
-              <w:lang w:val="en-US"/>
             </w:rPr>
-            <w:t>5</w:t>
+            <w:t>6</w:t>
           </w:r>
           <w:r>
             <w:rPr>
@@ -6296,6 +7116,16 @@
 </w:hdr>
 </file>
 
+<file path=word/header3.xml><?xml version="1.0" encoding="utf-8"?>
+<w:hdr xmlns:wpc="http://schemas.microsoft.com/office/word/2010/wordprocessingCanvas" xmlns:cx="http://schemas.microsoft.com/office/drawing/2014/chartex" xmlns:cx1="http://schemas.microsoft.com/office/drawing/2015/9/8/chartex" xmlns:cx2="http://schemas.microsoft.com/office/drawing/2015/10/21/chartex" xmlns:cx3="http://schemas.microsoft.com/office/drawing/2016/5/9/chartex" xmlns:cx4="http://schemas.microsoft.com/office/drawing/2016/5/10/chartex" xmlns:cx5="http://schemas.microsoft.com/office/drawing/2016/5/11/chartex" xmlns:cx6="http://schemas.microsoft.com/office/drawing/2016/5/12/chartex" xmlns:cx7="http://schemas.microsoft.com/office/drawing/2016/5/13/chartex" xmlns:cx8="http://schemas.microsoft.com/office/drawing/2016/5/14/chartex" xmlns:mc="http://schemas.openxmlformats.org/markup-compatibility/2006" xmlns:aink="http://schemas.microsoft.com/office/drawing/2016/ink" xmlns:am3d="http://schemas.microsoft.com/office/drawing/2017/model3d" xmlns:o="urn:schemas-microsoft-com:office:office" xmlns:oel="http://schemas.microsoft.com/office/2019/extlst" xmlns:r="http://schemas.openxmlformats.org/officeDocument/2006/relationships" xmlns:m="http://schemas.openxmlformats.org/officeDocument/2006/math" xmlns:v="urn:schemas-microsoft-com:vml" xmlns:wp14="http://schemas.microsoft.com/office/word/2010/wordprocessingDrawing" xmlns:wp="http://schemas.openxmlformats.org/drawingml/2006/wordprocessingDrawing" xmlns:w10="urn:schemas-microsoft-com:office:word" xmlns:w="http://schemas.openxmlformats.org/wordprocessingml/2006/main" xmlns:w14="http://schemas.microsoft.com/office/word/2010/wordml" xmlns:w15="http://schemas.microsoft.com/office/word/2012/wordml" xmlns:w16cex="http://schemas.microsoft.com/office/word/2018/wordml/cex" xmlns:w16cid="http://schemas.microsoft.com/office/word/2016/wordml/cid" xmlns:w16="http://schemas.microsoft.com/office/word/2018/wordml" xmlns:w16du="http://schemas.microsoft.com/office/word/2023/wordml/word16du" xmlns:w16sdtdh="http://schemas.microsoft.com/office/word/2020/wordml/sdtdatahash" xmlns:w16sdtfl="http://schemas.microsoft.com/office/word/2024/wordml/sdtformatlock" xmlns:w16se="http://schemas.microsoft.com/office/word/2015/wordml/symex" xmlns:wpg="http://schemas.microsoft.com/office/word/2010/wordprocessingGroup" xmlns:wpi="http://schemas.microsoft.com/office/word/2010/wordprocessingInk" xmlns:wne="http://schemas.microsoft.com/office/word/2006/wordml" xmlns:wps="http://schemas.microsoft.com/office/word/2010/wordprocessingShape" mc:Ignorable="w14 w15 w16se w16cid w16 w16cex w16sdtdh w16sdtfl w16du wp14">
+  <w:p>
+    <w:pPr>
+      <w:pStyle w:val="a5"/>
+    </w:pPr>
+  </w:p>
+</w:hdr>
+</file>
+
 <file path=word/numbering.xml><?xml version="1.0" encoding="utf-8"?>
 <w:numbering xmlns:wpc="http://schemas.microsoft.com/office/word/2010/wordprocessingCanvas" xmlns:cx="http://schemas.microsoft.com/office/drawing/2014/chartex" xmlns:cx1="http://schemas.microsoft.com/office/drawing/2015/9/8/chartex" xmlns:cx2="http://schemas.microsoft.com/office/drawing/2015/10/21/chartex" xmlns:cx3="http://schemas.microsoft.com/office/drawing/2016/5/9/chartex" xmlns:cx4="http://schemas.microsoft.com/office/drawing/2016/5/10/chartex" xmlns:cx5="http://schemas.microsoft.com/office/drawing/2016/5/11/chartex" xmlns:cx6="http://schemas.microsoft.com/office/drawing/2016/5/12/chartex" xmlns:cx7="http://schemas.microsoft.com/office/drawing/2016/5/13/chartex" xmlns:cx8="http://schemas.microsoft.com/office/drawing/2016/5/14/chartex" xmlns:mc="http://schemas.openxmlformats.org/markup-compatibility/2006" xmlns:aink="http://schemas.microsoft.com/office/drawing/2016/ink" xmlns:am3d="http://schemas.microsoft.com/office/drawing/2017/model3d" xmlns:o="urn:schemas-microsoft-com:office:office" xmlns:oel="http://schemas.microsoft.com/office/2019/extlst" xmlns:r="http://schemas.openxmlformats.org/officeDocument/2006/relationships" xmlns:m="http://schemas.openxmlformats.org/officeDocument/2006/math" xmlns:v="urn:schemas-microsoft-com:vml" xmlns:wp14="http://schemas.microsoft.com/office/word/2010/wordprocessingDrawing" xmlns:wp="http://schemas.openxmlformats.org/drawingml/2006/wordprocessingDrawing" xmlns:w10="urn:schemas-microsoft-com:office:word" xmlns:w="http://schemas.openxmlformats.org/wordprocessingml/2006/main" xmlns:w14="http://schemas.microsoft.com/office/word/2010/wordml" xmlns:w15="http://schemas.microsoft.com/office/word/2012/wordml" xmlns:w16cex="http://schemas.microsoft.com/office/word/2018/wordml/cex" xmlns:w16cid="http://schemas.microsoft.com/office/word/2016/wordml/cid" xmlns:w16="http://schemas.microsoft.com/office/word/2018/wordml" xmlns:w16du="http://schemas.microsoft.com/office/word/2023/wordml/word16du" xmlns:w16sdtdh="http://schemas.microsoft.com/office/word/2020/wordml/sdtdatahash" xmlns:w16sdtfl="http://schemas.microsoft.com/office/word/2024/wordml/sdtformatlock" xmlns:w16se="http://schemas.microsoft.com/office/word/2015/wordml/symex" xmlns:wpg="http://schemas.microsoft.com/office/word/2010/wordprocessingGroup" xmlns:wpi="http://schemas.microsoft.com/office/word/2010/wordprocessingInk" xmlns:wne="http://schemas.microsoft.com/office/word/2006/wordml" xmlns:wps="http://schemas.microsoft.com/office/word/2010/wordprocessingShape" mc:Ignorable="w14 w15 w16se w16cid w16 w16cex w16sdtdh w16sdtfl w16du wp14">
   <w:abstractNum w:abstractNumId="0" w15:restartNumberingAfterBreak="0">
@@ -7779,55 +8609,55 @@
       </w:pPr>
     </w:lvl>
   </w:abstractNum>
-  <w:num w:numId="1" w16cid:durableId="568152515">
+  <w:num w:numId="1" w16cid:durableId="442579163">
     <w:abstractNumId w:val="1"/>
   </w:num>
-  <w:num w:numId="2" w16cid:durableId="282004365">
+  <w:num w:numId="2" w16cid:durableId="2126078035">
     <w:abstractNumId w:val="1"/>
   </w:num>
-  <w:num w:numId="3" w16cid:durableId="1511482107">
+  <w:num w:numId="3" w16cid:durableId="1596548084">
     <w:abstractNumId w:val="1"/>
   </w:num>
-  <w:num w:numId="4" w16cid:durableId="1943297099">
+  <w:num w:numId="4" w16cid:durableId="1393428655">
     <w:abstractNumId w:val="0"/>
   </w:num>
-  <w:num w:numId="5" w16cid:durableId="864824987">
+  <w:num w:numId="5" w16cid:durableId="1109275667">
     <w:abstractNumId w:val="11"/>
   </w:num>
-  <w:num w:numId="6" w16cid:durableId="790438760">
+  <w:num w:numId="6" w16cid:durableId="1252735128">
     <w:abstractNumId w:val="2"/>
   </w:num>
-  <w:num w:numId="7" w16cid:durableId="693533739">
+  <w:num w:numId="7" w16cid:durableId="1273826514">
     <w:abstractNumId w:val="10"/>
   </w:num>
-  <w:num w:numId="8" w16cid:durableId="550120459">
+  <w:num w:numId="8" w16cid:durableId="267199613">
     <w:abstractNumId w:val="3"/>
   </w:num>
-  <w:num w:numId="9" w16cid:durableId="1200630152">
+  <w:num w:numId="9" w16cid:durableId="144667073">
     <w:abstractNumId w:val="13"/>
   </w:num>
-  <w:num w:numId="10" w16cid:durableId="127551298">
+  <w:num w:numId="10" w16cid:durableId="689918929">
     <w:abstractNumId w:val="8"/>
   </w:num>
-  <w:num w:numId="11" w16cid:durableId="1731152342">
+  <w:num w:numId="11" w16cid:durableId="740712592">
     <w:abstractNumId w:val="5"/>
   </w:num>
-  <w:num w:numId="12" w16cid:durableId="900942624">
+  <w:num w:numId="12" w16cid:durableId="533004860">
     <w:abstractNumId w:val="9"/>
   </w:num>
-  <w:num w:numId="13" w16cid:durableId="656879078">
+  <w:num w:numId="13" w16cid:durableId="482695217">
     <w:abstractNumId w:val="6"/>
   </w:num>
-  <w:num w:numId="14" w16cid:durableId="193419567">
+  <w:num w:numId="14" w16cid:durableId="1181821925">
     <w:abstractNumId w:val="4"/>
   </w:num>
-  <w:num w:numId="15" w16cid:durableId="1499879987">
+  <w:num w:numId="15" w16cid:durableId="1603301647">
     <w:abstractNumId w:val="12"/>
   </w:num>
-  <w:num w:numId="16" w16cid:durableId="1581866373">
+  <w:num w:numId="16" w16cid:durableId="731269739">
     <w:abstractNumId w:val="7"/>
   </w:num>
-  <w:num w:numId="17" w16cid:durableId="1950432251">
+  <w:num w:numId="17" w16cid:durableId="1505971168">
     <w:abstractNumId w:val="14"/>
   </w:num>
 </w:numbering>
@@ -8256,6 +9086,7 @@
   <w:style w:type="character" w:default="1" w:styleId="a1">
     <w:name w:val="Default Paragraph Font"/>
     <w:uiPriority w:val="1"/>
+    <w:semiHidden/>
     <w:unhideWhenUsed/>
   </w:style>
   <w:style w:type="table" w:default="1" w:styleId="a2">
@@ -8855,7 +9686,7 @@
 </file>
 
 <file path=customXml/itemProps1.xml><?xml version="1.0" encoding="utf-8"?>
-<ds:datastoreItem xmlns:ds="http://schemas.openxmlformats.org/officeDocument/2006/customXml" ds:itemID="{4BFC8996-B915-45B5-9AD6-3B20319BFF52}">
+<ds:datastoreItem xmlns:ds="http://schemas.openxmlformats.org/officeDocument/2006/customXml" ds:itemID="{B395637A-43AC-423A-BE6A-273828BE43A9}">
   <ds:schemaRefs>
     <ds:schemaRef ds:uri="http://schemas.openxmlformats.org/officeDocument/2006/bibliography"/>
   </ds:schemaRefs>

</xml_diff>